<commit_message>
docs(mobile): maquettes et dossier de design ; dernier passage AMD-02
- Dépôt du dossier de design (IdentiShield-CM_Design_Application_Mobile_v1.0
  .pptx, livrable L-8) et des 36 PNG du zip des maquettes dans
  docs/02-specifications/mobile/maquettes/ (noms inchangés) + README.md :
  écran → fichier → flux → MOB-F (SPEC §11, §19), palette, police, règle
  « référence visuelle de M-06 à M-08, tout écart documenté ».
- SPEC v1.2 : MT-04 « horodatage borné » barré (pas d'horodatage dans la
  chaîne ADR-018) ; §11 renvoie aux maquettes. CDC et SPEC v1.2 : documents
  amont → SRS v1.4, SAD v1.3, TM v1.3.
- TM v1.3 : S-08 et S-13 réécrits selon la logique en vigueur ; §11 ES-18
  « haché seul » ; S-17 aligné sur MT-04.
- Plan Kanban v1.2 §5 : cartes de dette « SRS v1.5 » et « TM v1.4 ».

Co-Authored-By: Claude Opus 5.5 (1M context) <noreply@anthropic.com>
</commit_message>
<xml_diff>
--- a/docs/02-specifications/mobile/ISC-MOB-CDC_Cahier_des_charges_App_Mobile_v1.2.docx
+++ b/docs/02-specifications/mobile/ISC-MOB-CDC_Cahier_des_charges_App_Mobile_v1.2.docx
@@ -942,11 +942,38 @@
                 <w:bCs w:val="false"/>
                 <w:i w:val="false"/>
                 <w:iCs w:val="false"/>
-                <w:color w:val="000000"/>
-                <w:sz w:val="20"/>
-                <w:szCs w:val="20"/>
-              </w:rPr>
-              <w:t xml:space="preserve">ISC-SRS-FR v1.3, ISC-SAD v1.2, Modèle de menace v1.2.1, ISC-AMD-01, ADR-029/030/031/033/034/035</w:t>
+                <w:strike/>
+                <w:color w:val="000000"/>
+                <w:sz w:val="20"/>
+                <w:szCs w:val="20"/>
+              </w:rPr>
+              <w:t xml:space="preserve">ISC-SRS-FR v1.3, ISC-SAD v1.2, Modèle de menace v1.2.1</w:t>
+            </w:r>
+            <w:r>
+              <w:rPr>
+                <w:rFonts w:ascii="Times New Roman" w:cs="Times New Roman" w:eastAsia="Times New Roman" w:hAnsi="Times New Roman"/>
+                <w:b w:val="false"/>
+                <w:bCs w:val="false"/>
+                <w:i w:val="false"/>
+                <w:iCs w:val="false"/>
+                <w:color w:val="000000"/>
+                <w:sz w:val="20"/>
+                <w:szCs w:val="20"/>
+              </w:rPr>
+              <w:t xml:space="preserve"> ISC-SRS-FR v1.4, ISC-SAD v1.3, Modèle de menace v1.3</w:t>
+            </w:r>
+            <w:r>
+              <w:rPr>
+                <w:rFonts w:ascii="Times New Roman" w:cs="Times New Roman" w:eastAsia="Times New Roman" w:hAnsi="Times New Roman"/>
+                <w:b w:val="false"/>
+                <w:bCs w:val="false"/>
+                <w:i w:val="false"/>
+                <w:iCs w:val="false"/>
+                <w:color w:val="000000"/>
+                <w:sz w:val="20"/>
+                <w:szCs w:val="20"/>
+              </w:rPr>
+              <w:t xml:space="preserve">, ISC-AMD-01, ADR-029/030/031/033/034/035</w:t>
             </w:r>
           </w:p>
         </w:tc>
@@ -1700,7 +1727,34 @@
                 <w:sz w:val="20"/>
                 <w:szCs w:val="20"/>
               </w:rPr>
-              <w:t xml:space="preserve"> Compléments du 25/09/2026 (décisions du propriétaire) : MOB-S-03 complétée (invalidation sur nouvelle biométrie) ; « biométrie liée à la signature » reformulé ; seul changement de conception : Android 11 (API 30) minimum (MOB-NF-01, QM-10).</w:t>
+              <w:t xml:space="preserve"> Compléments du 25/09/2026 (décisions du propriétaire) : MOB-S-03 complétée (invalidation sur nouvelle biométrie) ; « biométrie liée à la signature » reformulé ; seul changement de conception : </w:t>
+            </w:r>
+            <w:r>
+              <w:rPr>
+                <w:rFonts w:ascii="Times New Roman" w:cs="Times New Roman" w:eastAsia="Times New Roman" w:hAnsi="Times New Roman"/>
+                <w:b w:val="false"/>
+                <w:bCs w:val="false"/>
+                <w:i w:val="false"/>
+                <w:iCs w:val="false"/>
+                <w:strike/>
+                <w:color w:val="000000"/>
+                <w:sz w:val="20"/>
+                <w:szCs w:val="20"/>
+              </w:rPr>
+              <w:t xml:space="preserve">Android 11 (API 30) minimum (MOB-NF-01, QM-10).</w:t>
+            </w:r>
+            <w:r>
+              <w:rPr>
+                <w:rFonts w:ascii="Times New Roman" w:cs="Times New Roman" w:eastAsia="Times New Roman" w:hAnsi="Times New Roman"/>
+                <w:b w:val="false"/>
+                <w:bCs w:val="false"/>
+                <w:i w:val="false"/>
+                <w:iCs w:val="false"/>
+                <w:color w:val="000000"/>
+                <w:sz w:val="20"/>
+                <w:szCs w:val="20"/>
+              </w:rPr>
+              <w:t xml:space="preserve"> Android 11 (API 30) minimum (MOB-NF-01, QM-10). Relecture finale du 25/09/2026 : documents amont à jour.</w:t>
             </w:r>
           </w:p>
         </w:tc>

</xml_diff>